<commit_message>
Fix order ID collisions and refresh benchmark report
</commit_message>
<xml_diff>
--- a/4.3性能测试结果-Word版.docx
+++ b/4.3性能测试结果-Word版.docx
@@ -256,7 +256,7 @@
                 <w:b w:val="0"/>
                 <w:sz w:val="20"/>
               </w:rPr>
-              <w:t>25.29</w:t>
+              <w:t>29.67</w:t>
             </w:r>
           </w:p>
         </w:tc>
@@ -275,7 +275,7 @@
                 <w:b w:val="0"/>
                 <w:sz w:val="20"/>
               </w:rPr>
-              <w:t>34.59</w:t>
+              <w:t>38.36</w:t>
             </w:r>
           </w:p>
         </w:tc>
@@ -372,7 +372,7 @@
                 <w:b w:val="0"/>
                 <w:sz w:val="20"/>
               </w:rPr>
-              <w:t>45.33</w:t>
+              <w:t>56.79</w:t>
             </w:r>
           </w:p>
         </w:tc>
@@ -391,7 +391,7 @@
                 <w:b w:val="0"/>
                 <w:sz w:val="20"/>
               </w:rPr>
-              <w:t>65.38</w:t>
+              <w:t>89.98</w:t>
             </w:r>
           </w:p>
         </w:tc>
@@ -488,7 +488,7 @@
                 <w:b w:val="0"/>
                 <w:sz w:val="20"/>
               </w:rPr>
-              <w:t>67.64</w:t>
+              <w:t>76.47</w:t>
             </w:r>
           </w:p>
         </w:tc>
@@ -507,7 +507,7 @@
                 <w:b w:val="0"/>
                 <w:sz w:val="20"/>
               </w:rPr>
-              <w:t>110.43</w:t>
+              <w:t>131.53</w:t>
             </w:r>
           </w:p>
         </w:tc>
@@ -604,7 +604,7 @@
                 <w:b w:val="0"/>
                 <w:sz w:val="20"/>
               </w:rPr>
-              <w:t>37.54</w:t>
+              <w:t>29.35</w:t>
             </w:r>
           </w:p>
         </w:tc>
@@ -623,7 +623,7 @@
                 <w:b w:val="0"/>
                 <w:sz w:val="20"/>
               </w:rPr>
-              <w:t>180.22</w:t>
+              <w:t>60.79</w:t>
             </w:r>
           </w:p>
         </w:tc>
@@ -642,7 +642,7 @@
                 <w:b w:val="0"/>
                 <w:sz w:val="20"/>
               </w:rPr>
-              <w:t>99.00%</w:t>
+              <w:t>0.00%</w:t>
             </w:r>
           </w:p>
         </w:tc>
@@ -720,7 +720,7 @@
                 <w:b w:val="0"/>
                 <w:sz w:val="20"/>
               </w:rPr>
-              <w:t>50.37</w:t>
+              <w:t>56.06</w:t>
             </w:r>
           </w:p>
         </w:tc>
@@ -739,7 +739,7 @@
                 <w:b w:val="0"/>
                 <w:sz w:val="20"/>
               </w:rPr>
-              <w:t>71.88</w:t>
+              <w:t>81.62</w:t>
             </w:r>
           </w:p>
         </w:tc>
@@ -758,7 +758,7 @@
                 <w:b w:val="0"/>
                 <w:sz w:val="20"/>
               </w:rPr>
-              <w:t>99.67%</w:t>
+              <w:t>0.00%</w:t>
             </w:r>
           </w:p>
         </w:tc>
@@ -836,7 +836,7 @@
                 <w:b w:val="0"/>
                 <w:sz w:val="20"/>
               </w:rPr>
-              <w:t>76.17</w:t>
+              <w:t>80.77</w:t>
             </w:r>
           </w:p>
         </w:tc>
@@ -855,7 +855,7 @@
                 <w:b w:val="0"/>
                 <w:sz w:val="20"/>
               </w:rPr>
-              <w:t>119.44</w:t>
+              <w:t>136.35</w:t>
             </w:r>
           </w:p>
         </w:tc>
@@ -874,7 +874,7 @@
                 <w:b w:val="0"/>
                 <w:sz w:val="20"/>
               </w:rPr>
-              <w:t>99.80%</w:t>
+              <w:t>0.00%</w:t>
             </w:r>
           </w:p>
         </w:tc>
@@ -952,7 +952,7 @@
                 <w:b w:val="0"/>
                 <w:sz w:val="20"/>
               </w:rPr>
-              <w:t>68.06</w:t>
+              <w:t>75.79</w:t>
             </w:r>
           </w:p>
         </w:tc>
@@ -971,7 +971,7 @@
                 <w:b w:val="0"/>
                 <w:sz w:val="20"/>
               </w:rPr>
-              <w:t>84.83</w:t>
+              <w:t>100.74</w:t>
             </w:r>
           </w:p>
         </w:tc>
@@ -1068,7 +1068,7 @@
                 <w:b w:val="0"/>
                 <w:sz w:val="20"/>
               </w:rPr>
-              <w:t>157.50</w:t>
+              <w:t>191.53</w:t>
             </w:r>
           </w:p>
         </w:tc>
@@ -1087,7 +1087,7 @@
                 <w:b w:val="0"/>
                 <w:sz w:val="20"/>
               </w:rPr>
-              <w:t>187.19</w:t>
+              <w:t>250.03</w:t>
             </w:r>
           </w:p>
         </w:tc>
@@ -1184,7 +1184,7 @@
                 <w:b w:val="0"/>
                 <w:sz w:val="20"/>
               </w:rPr>
-              <w:t>245.74</w:t>
+              <w:t>326.22</w:t>
             </w:r>
           </w:p>
         </w:tc>
@@ -1203,7 +1203,7 @@
                 <w:b w:val="0"/>
                 <w:sz w:val="20"/>
               </w:rPr>
-              <w:t>326.68</w:t>
+              <w:t>494.65</w:t>
             </w:r>
           </w:p>
         </w:tc>
@@ -1239,7 +1239,7 @@
           <w:b w:val="0"/>
           <w:sz w:val="20"/>
         </w:rPr>
-        <w:t>如表4-x所示，在并发用户数分别为10、30和50的条件下，商品查询接口平均响应时间由25.29 ms上升至67.64 ms，95%响应时间由34.59 ms上升至110.43 ms，错误率始终为0，说明该接口在当前测试规模下具有较好的稳定性。推荐接口平均响应时间由68.06 ms上升至245.74 ms，95%响应时间由84.83 ms上升至326.68 ms，错误率同样保持为0，表明推荐模块在中低并发条件下能够稳定返回结果，但随着并发增加，推荐计算的耗时呈现较为明显的增长趋势。</w:t>
+        <w:t>如表4-x所示，在并发用户数分别为10、30和50的条件下，商品查询接口平均响应时间由29.67 ms上升至76.47 ms，95%响应时间由38.36 ms上升至131.53 ms，错误率最高为0.00%；推荐接口平均响应时间由75.79 ms上升至326.22 ms，95%响应时间由100.74 ms上升至494.65 ms，错误率最高为0.00%。上述结果说明商品查询接口与推荐接口在当前测试规模下均能够稳定返回结果，且随着并发增加，推荐接口的耗时增长相对更明显。</w:t>
       </w:r>
     </w:p>
     <w:p>
@@ -1253,7 +1253,7 @@
           <w:b w:val="0"/>
           <w:sz w:val="20"/>
         </w:rPr>
-        <w:t>订单提交接口在三档并发测试中均出现较高错误率。结合后端日志分析可知，主要原因并非数据库无法写入，而是当前订单号生成策略采用“秒级时间戳 + 用户ID”方式，在高并发条件下容易产生重复订单号，进而触发主键冲突，导致订单提交失败。因此，该测试结果反映出系统在事务写入链路上仍存在并发唯一性不足的问题。后续可通过引入毫秒级时间戳、雪花算法或UUID等方式优化订单号生成策略，从而提升高并发场景下的订单提交成功率。</w:t>
+        <w:t>订单提交接口在本轮测试中表现稳定。在并发用户数分别为10、30和50的条件下，其平均响应时间介于29.35 ms至80.77 ms之间，95%响应时间介于60.79 ms至136.35 ms之间，错误率最高为0.00%。说明在优化订单号生成策略后，订单写入链路已能够较好支撑当前中低并发场景下的提交请求。</w:t>
       </w:r>
     </w:p>
     <w:sectPr>

</xml_diff>